<commit_message>
chore: two fixed environments, staging and production
- Staging: APP_ENV=staging, database uphsl_credential_tracker_staging (new,
  holds the demo data). Production: APP_ENV=production, .env.production,
  database uphsl_credential_tracker rebuilt with base data only
- AppServiceProvider refuses any other APP_ENV (the test runner's internal
  testing mode excepted); private storage is split per environment
- Demo seeder and app:reset-demo run only in staging; tests use the staging
  database and refuse to start on any database not ending in _staging
- composer prod builds assets and serves production on :8001 with a queue
  worker; .env.production.example template; CI uses the staging database
- Docs, overview spec and DES-01/DES-02 describe both environments

Co-Authored-By: Claude Opus 5.5 <noreply@anthropic.com>
</commit_message>
<xml_diff>
--- a/docs/des/DES-01 System and Pipeline Specifications.docx
+++ b/docs/des/DES-01 System and Pipeline Specifications.docx
@@ -447,7 +447,70 @@
                 <w:sz w:val="18"/>
                 <w:szCs w:val="18"/>
               </w:rPr>
-              <w:t xml:space="preserve">MySQL 8.4, database uphsl_credential_tracker</w:t>
+              <w:t xml:space="preserve">MySQL 8.4: uphsl_credential_tracker (production) and uphsl_credential_tracker_staging (staging)</w:t>
+            </w:r>
+          </w:p>
+        </w:tc>
+      </w:tr>
+      <w:tr>
+        <w:trPr>
+          <w:cantSplit/>
+        </w:trPr>
+        <w:tc>
+          <w:tcPr>
+            <w:tcW w:type="dxa" w:w="2674"/>
+            <w:tcBorders>
+              <w:top w:val="single" w:color="999999" w:sz="4"/>
+              <w:left w:val="single" w:color="999999" w:sz="4"/>
+              <w:bottom w:val="single" w:color="999999" w:sz="4"/>
+              <w:right w:val="single" w:color="999999" w:sz="4"/>
+            </w:tcBorders>
+            <w:tcMar>
+              <w:top w:type="dxa" w:w="50"/>
+              <w:left w:type="dxa" w:w="90"/>
+              <w:bottom w:type="dxa" w:w="50"/>
+              <w:right w:type="dxa" w:w="90"/>
+            </w:tcMar>
+          </w:tcPr>
+          <w:p>
+            <w:r>
+              <w:rPr>
+                <w:rFonts w:ascii="Arial" w:cs="Arial" w:eastAsia="Arial" w:hAnsi="Arial"/>
+                <w:b w:val="false"/>
+                <w:bCs w:val="false"/>
+                <w:sz w:val="18"/>
+                <w:szCs w:val="18"/>
+              </w:rPr>
+              <w:t xml:space="preserve">Environments</w:t>
+            </w:r>
+          </w:p>
+        </w:tc>
+        <w:tc>
+          <w:tcPr>
+            <w:tcW w:type="dxa" w:w="6686"/>
+            <w:tcBorders>
+              <w:top w:val="single" w:color="999999" w:sz="4"/>
+              <w:left w:val="single" w:color="999999" w:sz="4"/>
+              <w:bottom w:val="single" w:color="999999" w:sz="4"/>
+              <w:right w:val="single" w:color="999999" w:sz="4"/>
+            </w:tcBorders>
+            <w:tcMar>
+              <w:top w:type="dxa" w:w="50"/>
+              <w:left w:type="dxa" w:w="90"/>
+              <w:bottom w:type="dxa" w:w="50"/>
+              <w:right w:type="dxa" w:w="90"/>
+            </w:tcMar>
+          </w:tcPr>
+          <w:p>
+            <w:r>
+              <w:rPr>
+                <w:rFonts w:ascii="Arial" w:cs="Arial" w:eastAsia="Arial" w:hAnsi="Arial"/>
+                <w:b w:val="false"/>
+                <w:bCs w:val="false"/>
+                <w:sz w:val="18"/>
+                <w:szCs w:val="18"/>
+              </w:rPr>
+              <w:t xml:space="preserve">Two: staging (development, demos, tests) and production (real use)</w:t>
             </w:r>
           </w:p>
         </w:tc>
@@ -1201,7 +1264,7 @@
                 <w:sz w:val="18"/>
                 <w:szCs w:val="18"/>
               </w:rPr>
-              <w:t xml:space="preserve">Stores users, departments, credential types, workflows, requests, steps, payment proofs, the ledger and notifications.</w:t>
+              <w:t xml:space="preserve">One database per environment (staging, production). Stores users, departments, credential types, workflows, requests, steps, payment proofs, the ledger and notifications.</w:t>
             </w:r>
           </w:p>
         </w:tc>

</xml_diff>

<commit_message>
feat(config): Gmail SMTP for production email and Cloudflare R2 for receipts
- Staging always uses the log mailer; production sends via Gmail SMTP. The
  sender defaults to MAIL_USERNAME (Gmail only sends from its own address)
- New r2 disk (S3-compatible, private, folder per environment) replaces the
  unused AWS s3 disk; RECEIPTS_DISK switches receipts between local and r2
  (RequestWorkflow::proofDisk()); tests stay on the local fake disk
- app:test-mail and app:test-storage commands check the settings per environment
- docs/setup-mail-and-storage.md: step-by-step Gmail App Password and R2
  bucket/token setup with troubleshooting; docs and DES-01 updated

Co-Authored-By: Claude Opus 5.5 <noreply@anthropic.com>
</commit_message>
<xml_diff>
--- a/docs/des/DES-01 System and Pipeline Specifications.docx
+++ b/docs/des/DES-01 System and Pipeline Specifications.docx
@@ -573,7 +573,70 @@
                 <w:sz w:val="18"/>
                 <w:szCs w:val="18"/>
               </w:rPr>
-              <w:t xml:space="preserve">Private local disk for payment receipts (not publicly reachable)</w:t>
+              <w:t xml:space="preserve">Cloudflare R2 private bucket for payment receipts (folders staging/ and production/)</w:t>
+            </w:r>
+          </w:p>
+        </w:tc>
+      </w:tr>
+      <w:tr>
+        <w:trPr>
+          <w:cantSplit/>
+        </w:trPr>
+        <w:tc>
+          <w:tcPr>
+            <w:tcW w:type="dxa" w:w="2674"/>
+            <w:tcBorders>
+              <w:top w:val="single" w:color="999999" w:sz="4"/>
+              <w:left w:val="single" w:color="999999" w:sz="4"/>
+              <w:bottom w:val="single" w:color="999999" w:sz="4"/>
+              <w:right w:val="single" w:color="999999" w:sz="4"/>
+            </w:tcBorders>
+            <w:tcMar>
+              <w:top w:type="dxa" w:w="50"/>
+              <w:left w:type="dxa" w:w="90"/>
+              <w:bottom w:type="dxa" w:w="50"/>
+              <w:right w:type="dxa" w:w="90"/>
+            </w:tcMar>
+          </w:tcPr>
+          <w:p>
+            <w:r>
+              <w:rPr>
+                <w:rFonts w:ascii="Arial" w:cs="Arial" w:eastAsia="Arial" w:hAnsi="Arial"/>
+                <w:b w:val="false"/>
+                <w:bCs w:val="false"/>
+                <w:sz w:val="18"/>
+                <w:szCs w:val="18"/>
+              </w:rPr>
+              <w:t xml:space="preserve">Email</w:t>
+            </w:r>
+          </w:p>
+        </w:tc>
+        <w:tc>
+          <w:tcPr>
+            <w:tcW w:type="dxa" w:w="6686"/>
+            <w:tcBorders>
+              <w:top w:val="single" w:color="999999" w:sz="4"/>
+              <w:left w:val="single" w:color="999999" w:sz="4"/>
+              <w:bottom w:val="single" w:color="999999" w:sz="4"/>
+              <w:right w:val="single" w:color="999999" w:sz="4"/>
+            </w:tcBorders>
+            <w:tcMar>
+              <w:top w:type="dxa" w:w="50"/>
+              <w:left w:type="dxa" w:w="90"/>
+              <w:bottom w:type="dxa" w:w="50"/>
+              <w:right w:type="dxa" w:w="90"/>
+            </w:tcMar>
+          </w:tcPr>
+          <w:p>
+            <w:r>
+              <w:rPr>
+                <w:rFonts w:ascii="Arial" w:cs="Arial" w:eastAsia="Arial" w:hAnsi="Arial"/>
+                <w:b w:val="false"/>
+                <w:bCs w:val="false"/>
+                <w:sz w:val="18"/>
+                <w:szCs w:val="18"/>
+              </w:rPr>
+              <w:t xml:space="preserve">Gmail SMTP in production; staging writes emails to a log file</w:t>
             </w:r>
           </w:p>
         </w:tc>
@@ -1298,7 +1361,7 @@
                 <w:sz w:val="18"/>
                 <w:szCs w:val="18"/>
               </w:rPr>
-              <w:t xml:space="preserve">Private file storage</w:t>
+              <w:t xml:space="preserve">Cloudflare R2 storage</w:t>
             </w:r>
           </w:p>
         </w:tc>
@@ -1327,7 +1390,7 @@
                 <w:sz w:val="18"/>
                 <w:szCs w:val="18"/>
               </w:rPr>
-              <w:t xml:space="preserve">Holds uploaded receipts. Files are served only to the owner and registrar accounts.</w:t>
+              <w:t xml:space="preserve">Private bucket holding uploaded receipts, one folder per environment. Files are served through the app only to the owner and registrar accounts.</w:t>
             </w:r>
           </w:p>
         </w:tc>
@@ -1361,7 +1424,7 @@
                 <w:sz w:val="18"/>
                 <w:szCs w:val="18"/>
               </w:rPr>
-              <w:t xml:space="preserve">Queue worker and mail server</w:t>
+              <w:t xml:space="preserve">Queue worker and Gmail SMTP</w:t>
             </w:r>
           </w:p>
         </w:tc>

</xml_diff>